<commit_message>
docs(rapports): E4 — met à jour les sections branches et CI webapp
Les commits précédents (fusion vers main, ajout de build-webapp/
deploy-webapp) rendaient obsolètes plusieurs passages du rapport E4 :
la branche "Branches" décrivait deux branches non fusionnées (elles le
sont, et supprimées depuis), §6 et §7.2 annonçaient l'absence de build
CI pour l'image webapp (elle existe désormais, cf. .github/workflows/
ci.yml). Bilan allégé des deux points désormais résolus.

Co-Authored-By: Claude Sonnet 5 <noreply@anthropic.com>
</commit_message>
<xml_diff>
--- a/rapports/Rapport_Bloc4_Application_Web_IA.docx
+++ b/rapports/Rapport_Bloc4_Application_Web_IA.docx
@@ -1026,7 +1026,7 @@
         <w:t xml:space="preserve">• Branches : </w:t>
       </w:r>
       <w:r>
-        <w:t>deux branches de travail réelles (bloc1_data, bloc2-bloc3-mise-en-service), divergentes depuis le commit initial du dépôt, non encore fusionnées dans main à ce stade : une limite reprise dans le bilan plutôt que dissimulée.</w:t>
+        <w:t>une branche de travail par changement, fusionnée dans main une fois validée (ex. CI_webapp, qui a ajouté le job de build de l'image webapp au §7), plutôt qu'un développement direct sur main.</w:t>
       </w:r>
     </w:p>
     <w:p>
@@ -2519,7 +2519,7 @@
     </w:p>
     <w:p>
       <w:r>
-        <w:t>Contrairement à test-bloc3, le job test-bloc4 n'est suivi d'aucune étape de build ou de déploiement d'image dans la chaîne actuelle (cf. §7) : une asymétrie assumée, reprise dans le bilan.</w:t>
+        <w:t>Comme pour test-bloc3, le job test-bloc4 est désormais suivi d'une étape de build et de déploiement d'image sur push vers main (cf. §7) : la chaîne webapp est alignée sur celle de ml-api.</w:t>
       </w:r>
     </w:p>
     <w:p>
@@ -2558,7 +2558,7 @@
     </w:p>
     <w:p>
       <w:r>
-        <w:t>Le service webapp est déclaré dans docker-compose.yml (build depuis app.Dockerfile, port 8090→8080, dépend de db/data-api/ml-api). Contrairement à ml-api (cf. rapport E3, jobs build-ml-api/deploy-ml-api qui publient une image sur ghcr.io après succès des tests), la chaîne CI actuelle ne construit ni ne publie d'image webapp vers un registre : le déploiement de Bloc4_app se fait uniquement par docker compose up --build en local, sans vérification automatisée de la construction de l'image en CI. C'est un écart réel avec la pratique déjà appliquée côté ml-api, repris dans le bilan comme axe d'harmonisation plutôt que présenté comme équivalent.</w:t>
+        <w:t>Le service webapp est déclaré dans docker-compose.yml (build depuis app.Dockerfile, port 8090→8080, dépend de db/data-api/ml-api). Comme pour ml-api (cf. rapport E3), la chaîne CI construit et publie désormais l'image sur ghcr.io après succès des tests (build-webapp, needs: test-bloc4) puis vérifie qu'elle est bien récupérable (deploy-webapp, needs: build-webapp), sur le même schéma que build-ml-api/deploy-ml-api. Comme pour ml-api, ce déploiement reste scopé à ce qui est vérifiable sans serveur de production dédié : deploy-webapp confirme que l'image est utilisable (docker pull) et documente la commande réelle de redéploiement (docker compose pull webapp &amp;&amp; docker compose up -d webapp) plutôt que de simuler un déploiement vers un serveur qui n'existe pas pour ce projet.</w:t>
       </w:r>
     </w:p>
     <w:p>
@@ -2658,7 +2658,7 @@
         <w:t xml:space="preserve">• Conduite de projet : </w:t>
       </w:r>
       <w:r>
-        <w:t>pas de board Kanban actif malgré l'intention initiale ; deux branches de travail non encore fusionnées dans main, à traiter avant une diffusion plus large.</w:t>
+        <w:t>pas de board Kanban actif malgré l'intention initiale : le suivi reste porté par les commits et les issues, pas par un outil de pilotage visuel dédié.</w:t>
       </w:r>
     </w:p>
     <w:p>
@@ -2692,17 +2692,6 @@
       </w:r>
       <w:r>
         <w:t>pas de scan automatisé de vulnérabilités des dépendances (pip-audit ou équivalent) ; DEBUG vaut True par défaut si la variable d'environnement n'est pas positionnée explicitement (seul docker-compose la force à False aujourd'hui).</w:t>
-      </w:r>
-    </w:p>
-    <w:p>
-      <w:r>
-        <w:rPr>
-          <w:b/>
-        </w:rPr>
-        <w:t xml:space="preserve">• Livraison continue : </w:t>
-      </w:r>
-      <w:r>
-        <w:t>contrairement à ml-api, aucune image webapp n'est construite ni publiée depuis la CI : le déploiement reste manuel (docker compose up --build).</w:t>
       </w:r>
     </w:p>
     <w:p>
@@ -3158,7 +3147,7 @@
               <w:rPr>
                 <w:sz w:val="18"/>
               </w:rPr>
-              <w:t>Bloc4_app/app.Dockerfile, entrypoint.sh, docker-compose.yml (service webapp)</w:t>
+              <w:t>Bloc4_app/app.Dockerfile, entrypoint.sh, docker-compose.yml (service webapp), .github/workflows/ci.yml (build-webapp, deploy-webapp)</w:t>
             </w:r>
           </w:p>
         </w:tc>

</xml_diff>

<commit_message>
docs(rapport-e4): ajoute les captures de la chaîne CI (C18, C19)
Le rapport E4 décrivait l'intégration et la livraison continues sans
aucune capture : ses 4 images étaient toutes des captures de l'appli.
Ajoute 4 figures issues du run #9 (commit f70b0e1), premier run
entièrement vert du dépôt :

- Figure 5 (§6) : vue d'ensemble, les 8 jobs et le graphe tests ->
  build -> vérification de récupération
- Figure 6 (§6) : job Bloc4 App — Tests, étapes réellement exécutées
- Figure 7 (§7) : job Build & Push — webapp, publication sur ghcr.io
- Figure 8 (§7) : job Deploy (verify pull) — webapp, image récupérée

Les légendes précisent que le détail des logs n'est pas visible :
GitHub le réserve aux utilisateurs authentifiés, et les captures ont
été prises sans authentification (dépôt public).

Ajoute les scripts de production des captures (Playwright + Chrome
système, puis recadrage PIL), sur le même modèle que assets_bloc4.

Co-Authored-By: Claude Opus 5 <noreply@anthropic.com>
</commit_message>
<xml_diff>
--- a/rapports/Rapport_Bloc4_Application_Web_IA.docx
+++ b/rapports/Rapport_Bloc4_Application_Web_IA.docx
@@ -2523,6 +2523,108 @@
       </w:r>
     </w:p>
     <w:p>
+      <w:pPr>
+        <w:jc w:val="center"/>
+      </w:pPr>
+      <w:r>
+        <w:drawing>
+          <wp:inline xmlns:a="http://schemas.openxmlformats.org/drawingml/2006/main" xmlns:pic="http://schemas.openxmlformats.org/drawingml/2006/picture">
+            <wp:extent cx="4680000" cy="2121839"/>
+            <wp:docPr id="5" name="Picture 5"/>
+            <wp:cNvGraphicFramePr>
+              <a:graphicFrameLocks noChangeAspect="1"/>
+            </wp:cNvGraphicFramePr>
+            <a:graphic>
+              <a:graphicData uri="http://schemas.openxmlformats.org/drawingml/2006/picture">
+                <pic:pic>
+                  <pic:nvPicPr>
+                    <pic:cNvPr id="0" name="crop_ci_overview.png"/>
+                    <pic:cNvPicPr/>
+                  </pic:nvPicPr>
+                  <pic:blipFill>
+                    <a:blip r:embed="rId13"/>
+                    <a:stretch>
+                      <a:fillRect/>
+                    </a:stretch>
+                  </pic:blipFill>
+                  <pic:spPr>
+                    <a:xfrm>
+                      <a:off x="0" y="0"/>
+                      <a:ext cx="4680000" cy="2121839"/>
+                    </a:xfrm>
+                    <a:prstGeom prst="rect"/>
+                  </pic:spPr>
+                </pic:pic>
+              </a:graphicData>
+            </a:graphic>
+          </wp:inline>
+        </w:drawing>
+      </w:r>
+    </w:p>
+    <w:p>
+      <w:pPr>
+        <w:jc w:val="center"/>
+      </w:pPr>
+      <w:r>
+        <w:rPr>
+          <w:i/>
+          <w:sz w:val="18"/>
+        </w:rPr>
+        <w:t>Figure 5 — Chaîne CI complète sur GitHub Actions (run #9, commit f70b0e1 sur main) : les huit jobs au vert, et l'enchaînement tests → build d'image → vérification de récupération, pour ml-api comme pour webapp.</w:t>
+      </w:r>
+    </w:p>
+    <w:p>
+      <w:pPr>
+        <w:jc w:val="center"/>
+      </w:pPr>
+      <w:r>
+        <w:drawing>
+          <wp:inline xmlns:a="http://schemas.openxmlformats.org/drawingml/2006/main" xmlns:pic="http://schemas.openxmlformats.org/drawingml/2006/picture">
+            <wp:extent cx="4680000" cy="1822988"/>
+            <wp:docPr id="6" name="Picture 6"/>
+            <wp:cNvGraphicFramePr>
+              <a:graphicFrameLocks noChangeAspect="1"/>
+            </wp:cNvGraphicFramePr>
+            <a:graphic>
+              <a:graphicData uri="http://schemas.openxmlformats.org/drawingml/2006/picture">
+                <pic:pic>
+                  <pic:nvPicPr>
+                    <pic:cNvPr id="0" name="crop_ci_tests_bloc4.png"/>
+                    <pic:cNvPicPr/>
+                  </pic:nvPicPr>
+                  <pic:blipFill>
+                    <a:blip r:embed="rId14"/>
+                    <a:stretch>
+                      <a:fillRect/>
+                    </a:stretch>
+                  </pic:blipFill>
+                  <pic:spPr>
+                    <a:xfrm>
+                      <a:off x="0" y="0"/>
+                      <a:ext cx="4680000" cy="1822988"/>
+                    </a:xfrm>
+                    <a:prstGeom prst="rect"/>
+                  </pic:spPr>
+                </pic:pic>
+              </a:graphicData>
+            </a:graphic>
+          </wp:inline>
+        </w:drawing>
+      </w:r>
+    </w:p>
+    <w:p>
+      <w:pPr>
+        <w:jc w:val="center"/>
+      </w:pPr>
+      <w:r>
+        <w:rPr>
+          <w:i/>
+          <w:sz w:val="18"/>
+        </w:rPr>
+        <w:t>Figure 6 — Job « Bloc4 App — Tests » : les étapes réellement exécutées (installation via uv, pytest avec couverture, dépôt du rapport de couverture en artefact). Le détail des logs n'apparaît pas : GitHub le réserve aux utilisateurs authentifiés.</w:t>
+      </w:r>
+    </w:p>
+    <w:p>
       <w:r>
         <w:br w:type="page"/>
       </w:r>
@@ -2572,6 +2674,108 @@
     <w:p>
       <w:r>
         <w:t>app.Dockerfile, entrypoint.sh, docker-compose.yml (service webapp) sont tous versionnés sur le dépôt distant.</w:t>
+      </w:r>
+    </w:p>
+    <w:p>
+      <w:pPr>
+        <w:jc w:val="center"/>
+      </w:pPr>
+      <w:r>
+        <w:drawing>
+          <wp:inline xmlns:a="http://schemas.openxmlformats.org/drawingml/2006/main" xmlns:pic="http://schemas.openxmlformats.org/drawingml/2006/picture">
+            <wp:extent cx="4680000" cy="1822988"/>
+            <wp:docPr id="7" name="Picture 7"/>
+            <wp:cNvGraphicFramePr>
+              <a:graphicFrameLocks noChangeAspect="1"/>
+            </wp:cNvGraphicFramePr>
+            <a:graphic>
+              <a:graphicData uri="http://schemas.openxmlformats.org/drawingml/2006/picture">
+                <pic:pic>
+                  <pic:nvPicPr>
+                    <pic:cNvPr id="0" name="crop_ci_build_webapp.png"/>
+                    <pic:cNvPicPr/>
+                  </pic:nvPicPr>
+                  <pic:blipFill>
+                    <a:blip r:embed="rId15"/>
+                    <a:stretch>
+                      <a:fillRect/>
+                    </a:stretch>
+                  </pic:blipFill>
+                  <pic:spPr>
+                    <a:xfrm>
+                      <a:off x="0" y="0"/>
+                      <a:ext cx="4680000" cy="1822988"/>
+                    </a:xfrm>
+                    <a:prstGeom prst="rect"/>
+                  </pic:spPr>
+                </pic:pic>
+              </a:graphicData>
+            </a:graphic>
+          </wp:inline>
+        </w:drawing>
+      </w:r>
+    </w:p>
+    <w:p>
+      <w:pPr>
+        <w:jc w:val="center"/>
+      </w:pPr>
+      <w:r>
+        <w:rPr>
+          <w:i/>
+          <w:sz w:val="18"/>
+        </w:rPr>
+        <w:t>Figure 7 — Job « Build &amp; Push — webapp (ghcr.io) » : authentification au registre, puis construction et publication de l'image, déclenchées sur push vers main après succès des tests.</w:t>
+      </w:r>
+    </w:p>
+    <w:p>
+      <w:pPr>
+        <w:jc w:val="center"/>
+      </w:pPr>
+      <w:r>
+        <w:drawing>
+          <wp:inline xmlns:a="http://schemas.openxmlformats.org/drawingml/2006/main" xmlns:pic="http://schemas.openxmlformats.org/drawingml/2006/picture">
+            <wp:extent cx="4680000" cy="1822988"/>
+            <wp:docPr id="8" name="Picture 8"/>
+            <wp:cNvGraphicFramePr>
+              <a:graphicFrameLocks noChangeAspect="1"/>
+            </wp:cNvGraphicFramePr>
+            <a:graphic>
+              <a:graphicData uri="http://schemas.openxmlformats.org/drawingml/2006/picture">
+                <pic:pic>
+                  <pic:nvPicPr>
+                    <pic:cNvPr id="0" name="crop_ci_deploy_webapp.png"/>
+                    <pic:cNvPicPr/>
+                  </pic:nvPicPr>
+                  <pic:blipFill>
+                    <a:blip r:embed="rId16"/>
+                    <a:stretch>
+                      <a:fillRect/>
+                    </a:stretch>
+                  </pic:blipFill>
+                  <pic:spPr>
+                    <a:xfrm>
+                      <a:off x="0" y="0"/>
+                      <a:ext cx="4680000" cy="1822988"/>
+                    </a:xfrm>
+                    <a:prstGeom prst="rect"/>
+                  </pic:spPr>
+                </pic:pic>
+              </a:graphicData>
+            </a:graphic>
+          </wp:inline>
+        </w:drawing>
+      </w:r>
+    </w:p>
+    <w:p>
+      <w:pPr>
+        <w:jc w:val="center"/>
+      </w:pPr>
+      <w:r>
+        <w:rPr>
+          <w:i/>
+          <w:sz w:val="18"/>
+        </w:rPr>
+        <w:t>Figure 8 — Job « Deploy (verify pull) — webapp » : l'image publiée est effectivement récupérée depuis ghcr.io, ce qui vérifie que le packaging est utilisable en pratique.</w:t>
       </w:r>
     </w:p>
     <w:p>

</xml_diff>